<commit_message>
Add addresses for remaining three recipients
Co-Authored-By: Claude Opus 5.5 <noreply@anthropic.com>
Claude-Session: https://claude.ai/code/session_01J3NTsmEhLtUpdxrpfiWApU
</commit_message>
<xml_diff>
--- a/output/ซองเรียน_95_หน่วย.docx
+++ b/output/ซองเรียน_95_หน่วย.docx
@@ -4250,44 +4250,77 @@
     <w:p>
       <w:pPr>
         <w:pageBreakBefore/>
+        <w:spacing w:before="540" w:after="0" w:line="364" w:lineRule="exact"/>
+        <w:ind w:left="-132"/>
+      </w:pPr>
+      <w:r>
+        <w:rPr>
+          <w:rFonts w:ascii="TH SarabunPSK" w:hAnsi="TH SarabunPSK" w:cs="TH SarabunPSK" w:eastAsia="TH SarabunPSK"/>
+          <w:b w:val="0"/>
+          <w:sz w:val="21"/>
+          <w:szCs w:val="21"/>
+        </w:rPr>
+        <w:t>วิทยาลัยป้องกันราชอาณาจักร</w:t>
+      </w:r>
+    </w:p>
+    <w:p>
+      <w:pPr>
         <w:spacing w:before="0" w:after="0" w:line="364" w:lineRule="exact"/>
-      </w:pPr>
-      <w:r>
-        <w:rPr>
-          <w:rFonts w:ascii="TH SarabunPSK" w:hAnsi="TH SarabunPSK" w:cs="TH SarabunPSK" w:eastAsia="TH SarabunPSK"/>
-          <w:b w:val="0"/>
-          <w:sz w:val="21"/>
-          <w:szCs w:val="21"/>
-        </w:rPr>
-        <w:t>วปอ.สปท.</w:t>
+        <w:ind w:left="-132"/>
+      </w:pPr>
+      <w:r>
+        <w:rPr>
+          <w:rFonts w:ascii="TH SarabunPSK" w:hAnsi="TH SarabunPSK" w:cs="TH SarabunPSK" w:eastAsia="TH SarabunPSK"/>
+          <w:b w:val="0"/>
+          <w:sz w:val="21"/>
+          <w:szCs w:val="21"/>
+        </w:rPr>
+        <w:t>สถาบันวิชาการป้องกันประเทศ</w:t>
       </w:r>
     </w:p>
     <w:p>
       <w:pPr>
         <w:spacing w:before="0" w:after="0" w:line="364" w:lineRule="exact"/>
-      </w:pPr>
-      <w:r>
-        <w:rPr>
-          <w:rFonts w:ascii="TH SarabunPSK" w:hAnsi="TH SarabunPSK" w:cs="TH SarabunPSK" w:eastAsia="TH SarabunPSK"/>
-          <w:b w:val="0"/>
-          <w:sz w:val="21"/>
-          <w:szCs w:val="21"/>
-        </w:rPr>
-        <w:t>กห ๐๓๑๗.๒/๑๖๑๑</w:t>
+        <w:ind w:left="-132"/>
+      </w:pPr>
+      <w:r>
+        <w:rPr>
+          <w:rFonts w:ascii="TH SarabunPSK" w:hAnsi="TH SarabunPSK" w:cs="TH SarabunPSK" w:eastAsia="TH SarabunPSK"/>
+          <w:b w:val="0"/>
+          <w:sz w:val="21"/>
+          <w:szCs w:val="21"/>
+        </w:rPr>
+        <w:t>๖๔ ถนนวิภาวดีรังสิต ดินแดง</w:t>
       </w:r>
     </w:p>
     <w:p>
       <w:pPr>
         <w:spacing w:before="0" w:after="0" w:line="364" w:lineRule="exact"/>
-      </w:pPr>
-      <w:r>
-        <w:rPr>
-          <w:rFonts w:ascii="TH SarabunPSK" w:hAnsi="TH SarabunPSK" w:cs="TH SarabunPSK" w:eastAsia="TH SarabunPSK"/>
-          <w:b w:val="0"/>
-          <w:sz w:val="21"/>
-          <w:szCs w:val="21"/>
-        </w:rPr>
-        <w:t>โทร. ๐ ๒๕๗๒ ๒๕๒๗</w:t>
+        <w:ind w:left="-132"/>
+      </w:pPr>
+      <w:r>
+        <w:rPr>
+          <w:rFonts w:ascii="TH SarabunPSK" w:hAnsi="TH SarabunPSK" w:cs="TH SarabunPSK" w:eastAsia="TH SarabunPSK"/>
+          <w:b w:val="0"/>
+          <w:sz w:val="21"/>
+          <w:szCs w:val="21"/>
+        </w:rPr>
+        <w:t>กรุงเทพฯ ๑๐๔๐๐</w:t>
+      </w:r>
+    </w:p>
+    <w:p>
+      <w:pPr>
+        <w:spacing w:before="0" w:after="0" w:line="364" w:lineRule="exact"/>
+        <w:ind w:left="-132"/>
+      </w:pPr>
+      <w:r>
+        <w:rPr>
+          <w:rFonts w:ascii="TH SarabunPSK" w:hAnsi="TH SarabunPSK" w:cs="TH SarabunPSK" w:eastAsia="TH SarabunPSK"/>
+          <w:b w:val="0"/>
+          <w:sz w:val="21"/>
+          <w:szCs w:val="21"/>
+        </w:rPr>
+        <w:t>ที่ กห ๐๓๑๗.๒/๑๖๑๑</w:t>
       </w:r>
     </w:p>
     <w:p>
@@ -4295,7 +4328,7 @@
         <w:tabs>
           <w:tab w:pos="3009" w:val="left"/>
         </w:tabs>
-        <w:spacing w:before="580" w:after="0" w:line="440" w:lineRule="exact"/>
+        <w:spacing w:before="200" w:after="0" w:line="440" w:lineRule="exact"/>
         <w:ind w:left="3009" w:hanging="720"/>
       </w:pPr>
       <w:r>
@@ -4309,6 +4342,28 @@
         <w:t>เรียน</w:t>
         <w:tab/>
         <w:t>คุณ เนวิน บุญฤทธิ์ ผู้จัดการธนาคาร ทีทีบี สาขาสนามเป้า</w:t>
+        <w:br/>
+      </w:r>
+      <w:r>
+        <w:rPr>
+          <w:rFonts w:ascii="TH SarabunPSK" w:hAnsi="TH SarabunPSK" w:cs="TH SarabunPSK" w:eastAsia="TH SarabunPSK"/>
+          <w:b/>
+          <w:sz w:val="26"/>
+          <w:szCs w:val="26"/>
+          <w:bCs/>
+        </w:rPr>
+        <w:t>เลขที่ ๙๕๙ ๑-๓ ถนนพหลโยธิน แขวงพญาไท</w:t>
+        <w:br/>
+      </w:r>
+      <w:r>
+        <w:rPr>
+          <w:rFonts w:ascii="TH SarabunPSK" w:hAnsi="TH SarabunPSK" w:cs="TH SarabunPSK" w:eastAsia="TH SarabunPSK"/>
+          <w:b/>
+          <w:sz w:val="26"/>
+          <w:szCs w:val="26"/>
+          <w:bCs/>
+        </w:rPr>
+        <w:t>เขตพญาไท กรุงเทพมหานคร ๑๐๔๐๐</w:t>
       </w:r>
     </w:p>
     <w:p>
@@ -5288,53 +5343,86 @@
     <w:p>
       <w:pPr>
         <w:pageBreakBefore/>
+        <w:spacing w:before="540" w:after="0" w:line="364" w:lineRule="exact"/>
+        <w:ind w:left="-132"/>
+      </w:pPr>
+      <w:r>
+        <w:rPr>
+          <w:rFonts w:ascii="TH SarabunPSK" w:hAnsi="TH SarabunPSK" w:cs="TH SarabunPSK" w:eastAsia="TH SarabunPSK"/>
+          <w:b w:val="0"/>
+          <w:sz w:val="21"/>
+          <w:szCs w:val="21"/>
+        </w:rPr>
+        <w:t>วิทยาลัยป้องกันราชอาณาจักร</w:t>
+      </w:r>
+    </w:p>
+    <w:p>
+      <w:pPr>
         <w:spacing w:before="0" w:after="0" w:line="364" w:lineRule="exact"/>
-      </w:pPr>
-      <w:r>
-        <w:rPr>
-          <w:rFonts w:ascii="TH SarabunPSK" w:hAnsi="TH SarabunPSK" w:cs="TH SarabunPSK" w:eastAsia="TH SarabunPSK"/>
-          <w:b w:val="0"/>
-          <w:sz w:val="21"/>
-          <w:szCs w:val="21"/>
-        </w:rPr>
-        <w:t>วปอ.สปท.</w:t>
+        <w:ind w:left="-132"/>
+      </w:pPr>
+      <w:r>
+        <w:rPr>
+          <w:rFonts w:ascii="TH SarabunPSK" w:hAnsi="TH SarabunPSK" w:cs="TH SarabunPSK" w:eastAsia="TH SarabunPSK"/>
+          <w:b w:val="0"/>
+          <w:sz w:val="21"/>
+          <w:szCs w:val="21"/>
+        </w:rPr>
+        <w:t>สถาบันวิชาการป้องกันประเทศ</w:t>
       </w:r>
     </w:p>
     <w:p>
       <w:pPr>
         <w:spacing w:before="0" w:after="0" w:line="364" w:lineRule="exact"/>
-      </w:pPr>
-      <w:r>
-        <w:rPr>
-          <w:rFonts w:ascii="TH SarabunPSK" w:hAnsi="TH SarabunPSK" w:cs="TH SarabunPSK" w:eastAsia="TH SarabunPSK"/>
-          <w:b w:val="0"/>
-          <w:sz w:val="21"/>
-          <w:szCs w:val="21"/>
-        </w:rPr>
-        <w:t>กห ๐๓๑๗.๒/๑๖๑๑</w:t>
+        <w:ind w:left="-132"/>
+      </w:pPr>
+      <w:r>
+        <w:rPr>
+          <w:rFonts w:ascii="TH SarabunPSK" w:hAnsi="TH SarabunPSK" w:cs="TH SarabunPSK" w:eastAsia="TH SarabunPSK"/>
+          <w:b w:val="0"/>
+          <w:sz w:val="21"/>
+          <w:szCs w:val="21"/>
+        </w:rPr>
+        <w:t>๖๔ ถนนวิภาวดีรังสิต ดินแดง</w:t>
       </w:r>
     </w:p>
     <w:p>
       <w:pPr>
         <w:spacing w:before="0" w:after="0" w:line="364" w:lineRule="exact"/>
-      </w:pPr>
-      <w:r>
-        <w:rPr>
-          <w:rFonts w:ascii="TH SarabunPSK" w:hAnsi="TH SarabunPSK" w:cs="TH SarabunPSK" w:eastAsia="TH SarabunPSK"/>
-          <w:b w:val="0"/>
-          <w:sz w:val="21"/>
-          <w:szCs w:val="21"/>
-        </w:rPr>
-        <w:t>โทร. ๐ ๒๕๗๒ ๒๕๒๗</w:t>
+        <w:ind w:left="-132"/>
+      </w:pPr>
+      <w:r>
+        <w:rPr>
+          <w:rFonts w:ascii="TH SarabunPSK" w:hAnsi="TH SarabunPSK" w:cs="TH SarabunPSK" w:eastAsia="TH SarabunPSK"/>
+          <w:b w:val="0"/>
+          <w:sz w:val="21"/>
+          <w:szCs w:val="21"/>
+        </w:rPr>
+        <w:t>กรุงเทพฯ ๑๐๔๐๐</w:t>
+      </w:r>
+    </w:p>
+    <w:p>
+      <w:pPr>
+        <w:spacing w:before="0" w:after="0" w:line="364" w:lineRule="exact"/>
+        <w:ind w:left="-132"/>
+      </w:pPr>
+      <w:r>
+        <w:rPr>
+          <w:rFonts w:ascii="TH SarabunPSK" w:hAnsi="TH SarabunPSK" w:cs="TH SarabunPSK" w:eastAsia="TH SarabunPSK"/>
+          <w:b w:val="0"/>
+          <w:sz w:val="21"/>
+          <w:szCs w:val="21"/>
+        </w:rPr>
+        <w:t>ที่ กห ๐๓๑๗.๒/๑๖๑๑</w:t>
       </w:r>
     </w:p>
     <w:p>
       <w:pPr>
         <w:tabs>
-          <w:tab w:pos="4665" w:val="left"/>
+          <w:tab w:pos="3677" w:val="left"/>
         </w:tabs>
-        <w:spacing w:before="580" w:after="0" w:line="440" w:lineRule="exact"/>
-        <w:ind w:left="4665" w:hanging="720"/>
+        <w:spacing w:before="200" w:after="0" w:line="440" w:lineRule="exact"/>
+        <w:ind w:left="3677" w:hanging="720"/>
       </w:pPr>
       <w:r>
         <w:rPr>
@@ -5347,6 +5435,28 @@
         <w:t>เรียน</w:t>
         <w:tab/>
         <w:t>บริษัท ไดนามิค ทัวร์ จำกัด</w:t>
+        <w:br/>
+      </w:r>
+      <w:r>
+        <w:rPr>
+          <w:rFonts w:ascii="TH SarabunPSK" w:hAnsi="TH SarabunPSK" w:cs="TH SarabunPSK" w:eastAsia="TH SarabunPSK"/>
+          <w:b/>
+          <w:sz w:val="26"/>
+          <w:szCs w:val="26"/>
+          <w:bCs/>
+        </w:rPr>
+        <w:t>เลขที่ ๑๔/๓๑๕๐ หมู่ที่ ๑๔ ตำบลบางบัวทอง</w:t>
+        <w:br/>
+      </w:r>
+      <w:r>
+        <w:rPr>
+          <w:rFonts w:ascii="TH SarabunPSK" w:hAnsi="TH SarabunPSK" w:cs="TH SarabunPSK" w:eastAsia="TH SarabunPSK"/>
+          <w:b/>
+          <w:sz w:val="26"/>
+          <w:szCs w:val="26"/>
+          <w:bCs/>
+        </w:rPr>
+        <w:t>อำเภอบางบัวทอง จังหวัดนนทบุรี ๑๑๑๑๐</w:t>
       </w:r>
     </w:p>
     <w:p>
@@ -6727,53 +6837,86 @@
     <w:p>
       <w:pPr>
         <w:pageBreakBefore/>
+        <w:spacing w:before="540" w:after="0" w:line="364" w:lineRule="exact"/>
+        <w:ind w:left="-132"/>
+      </w:pPr>
+      <w:r>
+        <w:rPr>
+          <w:rFonts w:ascii="TH SarabunPSK" w:hAnsi="TH SarabunPSK" w:cs="TH SarabunPSK" w:eastAsia="TH SarabunPSK"/>
+          <w:b w:val="0"/>
+          <w:sz w:val="21"/>
+          <w:szCs w:val="21"/>
+        </w:rPr>
+        <w:t>วิทยาลัยป้องกันราชอาณาจักร</w:t>
+      </w:r>
+    </w:p>
+    <w:p>
+      <w:pPr>
         <w:spacing w:before="0" w:after="0" w:line="364" w:lineRule="exact"/>
-      </w:pPr>
-      <w:r>
-        <w:rPr>
-          <w:rFonts w:ascii="TH SarabunPSK" w:hAnsi="TH SarabunPSK" w:cs="TH SarabunPSK" w:eastAsia="TH SarabunPSK"/>
-          <w:b w:val="0"/>
-          <w:sz w:val="21"/>
-          <w:szCs w:val="21"/>
-        </w:rPr>
-        <w:t>วปอ.สปท.</w:t>
+        <w:ind w:left="-132"/>
+      </w:pPr>
+      <w:r>
+        <w:rPr>
+          <w:rFonts w:ascii="TH SarabunPSK" w:hAnsi="TH SarabunPSK" w:cs="TH SarabunPSK" w:eastAsia="TH SarabunPSK"/>
+          <w:b w:val="0"/>
+          <w:sz w:val="21"/>
+          <w:szCs w:val="21"/>
+        </w:rPr>
+        <w:t>สถาบันวิชาการป้องกันประเทศ</w:t>
       </w:r>
     </w:p>
     <w:p>
       <w:pPr>
         <w:spacing w:before="0" w:after="0" w:line="364" w:lineRule="exact"/>
-      </w:pPr>
-      <w:r>
-        <w:rPr>
-          <w:rFonts w:ascii="TH SarabunPSK" w:hAnsi="TH SarabunPSK" w:cs="TH SarabunPSK" w:eastAsia="TH SarabunPSK"/>
-          <w:b w:val="0"/>
-          <w:sz w:val="21"/>
-          <w:szCs w:val="21"/>
-        </w:rPr>
-        <w:t>กห ๐๓๑๗.๒/๑๖๑๑</w:t>
+        <w:ind w:left="-132"/>
+      </w:pPr>
+      <w:r>
+        <w:rPr>
+          <w:rFonts w:ascii="TH SarabunPSK" w:hAnsi="TH SarabunPSK" w:cs="TH SarabunPSK" w:eastAsia="TH SarabunPSK"/>
+          <w:b w:val="0"/>
+          <w:sz w:val="21"/>
+          <w:szCs w:val="21"/>
+        </w:rPr>
+        <w:t>๖๔ ถนนวิภาวดีรังสิต ดินแดง</w:t>
       </w:r>
     </w:p>
     <w:p>
       <w:pPr>
         <w:spacing w:before="0" w:after="0" w:line="364" w:lineRule="exact"/>
-      </w:pPr>
-      <w:r>
-        <w:rPr>
-          <w:rFonts w:ascii="TH SarabunPSK" w:hAnsi="TH SarabunPSK" w:cs="TH SarabunPSK" w:eastAsia="TH SarabunPSK"/>
-          <w:b w:val="0"/>
-          <w:sz w:val="21"/>
-          <w:szCs w:val="21"/>
-        </w:rPr>
-        <w:t>โทร. ๐ ๒๕๗๒ ๒๕๒๗</w:t>
+        <w:ind w:left="-132"/>
+      </w:pPr>
+      <w:r>
+        <w:rPr>
+          <w:rFonts w:ascii="TH SarabunPSK" w:hAnsi="TH SarabunPSK" w:cs="TH SarabunPSK" w:eastAsia="TH SarabunPSK"/>
+          <w:b w:val="0"/>
+          <w:sz w:val="21"/>
+          <w:szCs w:val="21"/>
+        </w:rPr>
+        <w:t>กรุงเทพฯ ๑๐๔๐๐</w:t>
+      </w:r>
+    </w:p>
+    <w:p>
+      <w:pPr>
+        <w:spacing w:before="0" w:after="0" w:line="364" w:lineRule="exact"/>
+        <w:ind w:left="-132"/>
+      </w:pPr>
+      <w:r>
+        <w:rPr>
+          <w:rFonts w:ascii="TH SarabunPSK" w:hAnsi="TH SarabunPSK" w:cs="TH SarabunPSK" w:eastAsia="TH SarabunPSK"/>
+          <w:b w:val="0"/>
+          <w:sz w:val="21"/>
+          <w:szCs w:val="21"/>
+        </w:rPr>
+        <w:t>ที่ กห ๐๓๑๗.๒/๑๖๑๑</w:t>
       </w:r>
     </w:p>
     <w:p>
       <w:pPr>
         <w:tabs>
-          <w:tab w:pos="4931" w:val="left"/>
+          <w:tab w:pos="3319" w:val="left"/>
         </w:tabs>
-        <w:spacing w:before="580" w:after="0" w:line="440" w:lineRule="exact"/>
-        <w:ind w:left="4931" w:hanging="720"/>
+        <w:spacing w:before="200" w:after="0" w:line="440" w:lineRule="exact"/>
+        <w:ind w:left="3319" w:hanging="720"/>
       </w:pPr>
       <w:r>
         <w:rPr>
@@ -6786,6 +6929,28 @@
         <w:t>เรียน</w:t>
         <w:tab/>
         <w:t>ร้าน สูทเวิลด์เซ็นเตอร์</w:t>
+        <w:br/>
+      </w:r>
+      <w:r>
+        <w:rPr>
+          <w:rFonts w:ascii="TH SarabunPSK" w:hAnsi="TH SarabunPSK" w:cs="TH SarabunPSK" w:eastAsia="TH SarabunPSK"/>
+          <w:b/>
+          <w:sz w:val="26"/>
+          <w:szCs w:val="26"/>
+          <w:bCs/>
+        </w:rPr>
+        <w:t>เลขที่ ๔๙๓/๒๘ ซอยบุญเหลือ ถนนประชาราษฎร์ ๒</w:t>
+        <w:br/>
+      </w:r>
+      <w:r>
+        <w:rPr>
+          <w:rFonts w:ascii="TH SarabunPSK" w:hAnsi="TH SarabunPSK" w:cs="TH SarabunPSK" w:eastAsia="TH SarabunPSK"/>
+          <w:b/>
+          <w:sz w:val="26"/>
+          <w:szCs w:val="26"/>
+          <w:bCs/>
+        </w:rPr>
+        <w:t>แขวงบางซื่อ เขตบางซื่อ กรุงเทพมหานคร ๑๐๘๐๐</w:t>
       </w:r>
     </w:p>
     <w:p>

</xml_diff>

<commit_message>
Match เรียน names to the invitation letters (V1)
Co-Authored-By: Claude Opus 5.5 <noreply@anthropic.com>
Claude-Session: https://claude.ai/code/session_01J3NTsmEhLtUpdxrpfiWApU
</commit_message>
<xml_diff>
--- a/output/ซองเรียน_95_หน่วย.docx
+++ b/output/ซองเรียน_95_หน่วย.docx
@@ -4326,10 +4326,10 @@
     <w:p>
       <w:pPr>
         <w:tabs>
-          <w:tab w:pos="2987" w:val="left"/>
+          <w:tab w:pos="2429" w:val="left"/>
         </w:tabs>
         <w:spacing w:before="200" w:after="0" w:line="440" w:lineRule="exact"/>
-        <w:ind w:left="2987" w:hanging="720"/>
+        <w:ind w:left="2429" w:hanging="720"/>
       </w:pPr>
       <w:r>
         <w:rPr>
@@ -4341,7 +4341,7 @@
         </w:rPr>
         <w:t>เรียน</w:t>
         <w:tab/>
-        <w:t>คุณ เนวิน บุญฤทธิ์ ผู้จัดการธนาคาร ทีทีบี สาขาสนามเป้า</w:t>
+        <w:t>คุณเนวิน บุญฤทธิ์ ผู้จัดการธนาคารทหารไทยธนชาต สาขาสนามเป้า</w:t>
         <w:br/>
       </w:r>
       <w:r>
@@ -4445,10 +4445,10 @@
     <w:p>
       <w:pPr>
         <w:tabs>
-          <w:tab w:pos="3183" w:val="left"/>
+          <w:tab w:pos="3005" w:val="left"/>
         </w:tabs>
         <w:spacing w:before="200" w:after="0" w:line="440" w:lineRule="exact"/>
-        <w:ind w:left="3183" w:hanging="720"/>
+        <w:ind w:left="3005" w:hanging="720"/>
       </w:pPr>
       <w:r>
         <w:rPr>
@@ -4460,7 +4460,7 @@
         </w:rPr>
         <w:t>เรียน</w:t>
         <w:tab/>
-        <w:t>บริษัท เพชราภรณ์ กรุ๊ป แทรเวล จำกัด</w:t>
+        <w:t>กรรมการผู้จัดการ บริษัท เพชราภรณ์ กรุ๊ป แทรเวล จำกัด</w:t>
         <w:br/>
       </w:r>
       <w:r>
@@ -4579,7 +4579,7 @@
         </w:rPr>
         <w:t>เรียน</w:t>
         <w:tab/>
-        <w:t>บริษัท ซูพีเรียร์ ทัวร์ จำกัด</w:t>
+        <w:t>กรรมการผู้จัดการ บริษัท ซูพีเรียร์ ทัวร์ จำกัด</w:t>
         <w:br/>
       </w:r>
       <w:r>
@@ -4709,7 +4709,7 @@
         </w:rPr>
         <w:t>เรียน</w:t>
         <w:tab/>
-        <w:t>บริษัท กรีน เวย์ แทรเวล จำกัด</w:t>
+        <w:t>กรรมการผู้จัดการ บริษัท กรีน เวย์ แทรเวล จำกัด</w:t>
         <w:br/>
       </w:r>
       <w:r>
@@ -4839,7 +4839,7 @@
         </w:rPr>
         <w:t>เรียน</w:t>
         <w:tab/>
-        <w:t>บริษัท เวิลด์ แทรเวิล ดีไซน์ จำกัด</w:t>
+        <w:t>กรรมการผู้จัดการ บริษัท เวิลด์ แทรเวิล ดีไซน์ จำกัด</w:t>
         <w:br/>
       </w:r>
       <w:r>
@@ -4958,7 +4958,7 @@
         </w:rPr>
         <w:t>เรียน</w:t>
         <w:tab/>
-        <w:t>บริษัท มาร์วิน แทรเวิล จำกัด</w:t>
+        <w:t>กรรมการผู้จัดการ บริษัท มาร์วิน แทรเวิล จำกัด</w:t>
         <w:br/>
       </w:r>
       <w:r>
@@ -5077,7 +5077,7 @@
         </w:rPr>
         <w:t>เรียน</w:t>
         <w:tab/>
-        <w:t>บริษัท อัลโมโด ทัวร์ จำกัด</w:t>
+        <w:t>กรรมการผู้จัดการ บริษัท อัลโมโด ทัวร์ จำกัด</w:t>
         <w:br/>
       </w:r>
       <w:r>
@@ -5207,7 +5207,7 @@
         </w:rPr>
         <w:t>เรียน</w:t>
         <w:tab/>
-        <w:t>บริษัท ออล อิน ทราเวล จำกัด</w:t>
+        <w:t>กรรมการผู้จัดการ บริษัท ออล อิน ทราเวล จำกัด</w:t>
         <w:br/>
       </w:r>
       <w:r>
@@ -5326,7 +5326,7 @@
         </w:rPr>
         <w:t>เรียน</w:t>
         <w:tab/>
-        <w:t>บริษัท นีโอ ทราเวล จำกัด</w:t>
+        <w:t>กรรมการผู้จัดการ บริษัท นีโอ ทราเวล จำกัด</w:t>
         <w:br/>
       </w:r>
       <w:r>
@@ -5430,10 +5430,10 @@
     <w:p>
       <w:pPr>
         <w:tabs>
-          <w:tab w:pos="3660" w:val="left"/>
+          <w:tab w:pos="3652" w:val="left"/>
         </w:tabs>
         <w:spacing w:before="200" w:after="0" w:line="440" w:lineRule="exact"/>
-        <w:ind w:left="3660" w:hanging="720"/>
+        <w:ind w:left="3652" w:hanging="720"/>
       </w:pPr>
       <w:r>
         <w:rPr>
@@ -5445,7 +5445,7 @@
         </w:rPr>
         <w:t>เรียน</w:t>
         <w:tab/>
-        <w:t>บริษัท ไดนามิค ทัวร์ จำกัด</w:t>
+        <w:t>กรรมการผู้จัดการ บริษัท ไดนามิค ทัวร์ จำกัด</w:t>
         <w:br/>
       </w:r>
       <w:r>
@@ -5549,10 +5549,10 @@
     <w:p>
       <w:pPr>
         <w:tabs>
-          <w:tab w:pos="3494" w:val="left"/>
+          <w:tab w:pos="3112" w:val="left"/>
         </w:tabs>
         <w:spacing w:before="200" w:after="0" w:line="440" w:lineRule="exact"/>
-        <w:ind w:left="3494" w:hanging="720"/>
+        <w:ind w:left="3112" w:hanging="720"/>
       </w:pPr>
       <w:r>
         <w:rPr>
@@ -5564,7 +5564,7 @@
         </w:rPr>
         <w:t>เรียน</w:t>
         <w:tab/>
-        <w:t>บริษัท ธนัชวิชญ์ แทรเวล กรุ๊ป จำกัด</w:t>
+        <w:t>กรรมการผู้จัดการ บริษัท ธนัชวิชญ์ แทรเวล กรุ๊ป จำกัด</w:t>
         <w:br/>
       </w:r>
       <w:r>
@@ -5694,7 +5694,7 @@
         </w:rPr>
         <w:t>เรียน</w:t>
         <w:tab/>
-        <w:t>K-MAN Distribution (เค-แมน ดิสทริบิวชั่น)</w:t>
+        <w:t>กรรมการผู้จัดการ บริษัท เค-แมน ดีสตริบิวชั่น จำกัด</w:t>
         <w:br/>
       </w:r>
       <w:r>
@@ -5813,7 +5813,7 @@
         </w:rPr>
         <w:t>เรียน</w:t>
         <w:tab/>
-        <w:t>บริษัท อภิสฤษฎิ์ จำกัด</w:t>
+        <w:t>กรรมการผู้จัดการ บริษัท อภิสฤษฎิ์ จำกัด</w:t>
         <w:br/>
       </w:r>
       <w:r>
@@ -5928,10 +5928,10 @@
     <w:p>
       <w:pPr>
         <w:tabs>
-          <w:tab w:pos="3712" w:val="left"/>
+          <w:tab w:pos="3711" w:val="left"/>
         </w:tabs>
         <w:spacing w:before="200" w:after="0" w:line="440" w:lineRule="exact"/>
-        <w:ind w:left="3712" w:hanging="720"/>
+        <w:ind w:left="3711" w:hanging="720"/>
       </w:pPr>
       <w:r>
         <w:rPr>
@@ -5943,7 +5943,7 @@
         </w:rPr>
         <w:t>เรียน</w:t>
         <w:tab/>
-        <w:t>บริษัท กีล่า สปอร์ต จำกัด</w:t>
+        <w:t>กรรมการผู้จัดการ บริษัท กีล่า สปอร์ต จำกัด</w:t>
         <w:br/>
       </w:r>
       <w:r>
@@ -6073,7 +6073,7 @@
         </w:rPr>
         <w:t>เรียน</w:t>
         <w:tab/>
-        <w:t>บริษัท วี.เค.การ์เมนท์ จำกัด (สำนักงานใหญ่)</w:t>
+        <w:t>กรรมการผู้จัดการ บริษัท วี.เค.การ์เมนท์ จำกัด</w:t>
         <w:br/>
       </w:r>
       <w:r>
@@ -6192,7 +6192,7 @@
         </w:rPr>
         <w:t>เรียน</w:t>
         <w:tab/>
-        <w:t>บริษัท พลอยศรีรัฐ ซัพพลาย จำกัด (สำนักงานใหญ่)</w:t>
+        <w:t>กรรมการผู้จัดการ บริษัท พลอยศรีรัฐ ซัพลาย จำกัด</w:t>
         <w:br/>
       </w:r>
       <w:r>
@@ -6430,7 +6430,7 @@
         </w:rPr>
         <w:t>เรียน</w:t>
         <w:tab/>
-        <w:t>ร้าน สูทสภา (อรุณลักษณ์สูทสภา)</w:t>
+        <w:t>ผู้จัดการ ร้าน สูทสภา</w:t>
         <w:br/>
       </w:r>
       <w:r>
@@ -6560,7 +6560,7 @@
         </w:rPr>
         <w:t>เรียน</w:t>
         <w:tab/>
-        <w:t>ร้าน John Perfect Tailor</w:t>
+        <w:t>ผู้จัดการ ร้าน John Perfect Tailor</w:t>
         <w:br/>
       </w:r>
       <w:r>
@@ -6679,7 +6679,7 @@
         </w:rPr>
         <w:t>เรียน</w:t>
         <w:tab/>
-        <w:t>ร้าน เด่นแชมป์สูท</w:t>
+        <w:t>ผู้จัดการ ร้าน เด่นแชมป์สูท</w:t>
         <w:br/>
       </w:r>
       <w:r>
@@ -6809,7 +6809,7 @@
         </w:rPr>
         <w:t>เรียน</w:t>
         <w:tab/>
-        <w:t>ร้าน AR Tailor House (ร้านชูวิทย์)</w:t>
+        <w:t>ผู้จัดการ ร้าน AR Tailor House</w:t>
         <w:br/>
       </w:r>
       <w:r>
@@ -6939,7 +6939,7 @@
         </w:rPr>
         <w:t>เรียน</w:t>
         <w:tab/>
-        <w:t>ร้าน สูทเวิลด์เซ็นเตอร์</w:t>
+        <w:t>ผู้จัดการ ร้าน สูทเวิลด์เซ็นเตอร์</w:t>
         <w:br/>
       </w:r>
       <w:r>
@@ -7058,7 +7058,7 @@
         </w:rPr>
         <w:t>เรียน</w:t>
         <w:tab/>
-        <w:t>ร้าน ช่อชัยพฤกษ์</w:t>
+        <w:t>ผู้จัดการ ร้าน ช่อชัยพฤกษ์</w:t>
         <w:br/>
       </w:r>
       <w:r>
@@ -7188,7 +7188,7 @@
         </w:rPr>
         <w:t>เรียน</w:t>
         <w:tab/>
-        <w:t>บริษัท สูทแน็ค จำกัด</w:t>
+        <w:t>กรรมการผู้จัดการ บริษัท สูทแน็ค จำกัด</w:t>
         <w:br/>
       </w:r>
       <w:r>
@@ -7307,7 +7307,7 @@
         </w:rPr>
         <w:t>เรียน</w:t>
         <w:tab/>
-        <w:t>ร้าน สูททนง</w:t>
+        <w:t>ผู้จัดการ ร้าน สูททนง</w:t>
         <w:br/>
       </w:r>
       <w:r>
@@ -7426,7 +7426,7 @@
         </w:rPr>
         <w:t>เรียน</w:t>
         <w:tab/>
-        <w:t>ร้าน Aek Siam Tailor</w:t>
+        <w:t>ผู้จัดการ ร้าน Aek Siam Tailor</w:t>
         <w:br/>
       </w:r>
       <w:r>
@@ -7545,7 +7545,7 @@
         </w:rPr>
         <w:t>เรียน</w:t>
         <w:tab/>
-        <w:t>บริษัท ทวินสูท จำกัด</w:t>
+        <w:t>กรรมการผู้จัดการ บริษัท ทวินสูท จำกัด</w:t>
         <w:br/>
       </w:r>
       <w:r>
@@ -7675,7 +7675,7 @@
         </w:rPr>
         <w:t>เรียน</w:t>
         <w:tab/>
-        <w:t>บริษัท ไนน์สูท จำกัด</w:t>
+        <w:t>กรรมการผู้จัดการ บริษัท ไนน์สูท จำกัด</w:t>
         <w:br/>
       </w:r>
       <w:r>

</xml_diff>